<commit_message>
Ship company-document memos, payslip email, and People360 1.0.3.
Timekeeping memos now email a legal PDF that matches Memo Preview field size and layout, and this release also includes the form builder, payslip sending, and related payroll/employee updates.

Co-authored-by: Cursor <cursoragent@cursor.com>
</commit_message>
<xml_diff>
--- a/docs/People360-HRIS-Blueprint-Status-2026-08-27.docx
+++ b/docs/People360-HRIS-Blueprint-Status-2026-08-27.docx
@@ -56,7 +56,7 @@
           <w:color w:val="475569"/>
           <w:sz w:val="20"/>
         </w:rPr>
-        <w:t>Date: 27 August 2026  |  Audience: Management, HR, and project stakeholders</w:t>
+        <w:t>Date: 29 August 2026  |  Audience: Management, HR, and project stakeholders</w:t>
       </w:r>
     </w:p>
     <w:p>
@@ -117,7 +117,7 @@
           <w:color w:val="475569"/>
           <w:sz w:val="22"/>
         </w:rPr>
-        <w:t>Ready — Fully matches the blueprint for day-to-day use. (None of the 28 are 100% ready yet.)</w:t>
+        <w:t>Ready — Matches the agreed product scope for day-to-day use on that surface.</w:t>
       </w:r>
     </w:p>
     <w:p>
@@ -275,12 +275,21 @@
             <w:shd w:fill="DCFCE7" w:val="clear"/>
           </w:tcPr>
           <w:p>
-            <w:r/>
             <w:r>
               <w:rPr>
                 <w:rFonts w:ascii="Calibri" w:hAnsi="Calibri" w:eastAsia="Calibri"/>
                 <w:b/>
                 <w:i w:val="0"/>
+                <w:color w:val="166534"/>
+                <w:sz w:val="16"/>
+              </w:rPr>
+            </w:r>
+            <w:r>
+              <w:rPr>
+                <w:rFonts w:ascii="Calibri" w:hAnsi="Calibri" w:eastAsia="Calibri"/>
+                <w:b/>
+                <w:i w:val="0"/>
+                <w:color w:val="166534"/>
                 <w:sz w:val="16"/>
               </w:rPr>
               <w:t>Ready</w:t>
@@ -300,7 +309,7 @@
                 <w:i w:val="0"/>
                 <w:sz w:val="16"/>
               </w:rPr>
-              <w:t>0 of 28</w:t>
+              <w:t>3 of 28</w:t>
             </w:r>
           </w:p>
         </w:tc>
@@ -317,7 +326,7 @@
                 <w:i w:val="0"/>
                 <w:sz w:val="16"/>
               </w:rPr>
-              <w:t>No module is complete vs the full blueprint.</w:t>
+              <w:t>M01 Organization &amp; HR Configuration; M05 Time, Attendance &amp; Scheduling; M06 Leave &amp; Absence (desktop; Combined follows desktop).</w:t>
             </w:r>
           </w:p>
         </w:tc>
@@ -363,7 +372,7 @@
                 <w:i w:val="0"/>
                 <w:sz w:val="16"/>
               </w:rPr>
-              <w:t>13 of 28</w:t>
+              <w:t>10 of 28</w:t>
             </w:r>
           </w:p>
         </w:tc>
@@ -510,7 +519,7 @@
           <w:color w:val="475569"/>
           <w:sz w:val="22"/>
         </w:rPr>
-        <w:t>Still missing on both: recruitment, leave filing/balances, contractors, discipline cases, full clearance/separation, live clock-in.</w:t>
+        <w:t>Still missing on both: recruitment, contractors, discipline, full clearance/separation. Leave filing/balances and live clock-in — Web, not Desktop.</w:t>
       </w:r>
     </w:p>
     <w:p>
@@ -541,6 +550,96 @@
           <w:sz w:val="24"/>
         </w:rPr>
         <w:t>On Desktop</w:t>
+      </w:r>
+    </w:p>
+    <w:p>
+      <w:pPr>
+        <w:spacing w:after="40"/>
+      </w:pPr>
+      <w:r>
+        <w:rPr>
+          <w:rFonts w:ascii="Calibri" w:hAnsi="Calibri" w:eastAsia="Calibri"/>
+          <w:b/>
+          <w:i w:val="0"/>
+          <w:color w:val="0B318F"/>
+          <w:sz w:val="22"/>
+        </w:rPr>
+        <w:t>Organization &amp; HR setup (M01)</w:t>
+      </w:r>
+    </w:p>
+    <w:p>
+      <w:pPr>
+        <w:spacing w:after="120"/>
+      </w:pPr>
+      <w:r>
+        <w:rPr>
+          <w:rFonts w:ascii="Calibri" w:hAnsi="Calibri" w:eastAsia="Calibri"/>
+          <w:b w:val="0"/>
+          <w:i w:val="0"/>
+          <w:color w:val="475569"/>
+          <w:sz w:val="20"/>
+        </w:rPr>
+        <w:t>Campuses, colleges, programs, departments, positions, designations, ranks, employment types, payroll calendar, holidays, users and roles. Org chart deferred. Approval matrices will be built on Web, not Desktop.</w:t>
+      </w:r>
+    </w:p>
+    <w:p>
+      <w:pPr>
+        <w:spacing w:after="40"/>
+      </w:pPr>
+      <w:r>
+        <w:rPr>
+          <w:rFonts w:ascii="Calibri" w:hAnsi="Calibri" w:eastAsia="Calibri"/>
+          <w:b/>
+          <w:i w:val="0"/>
+          <w:color w:val="0B318F"/>
+          <w:sz w:val="22"/>
+        </w:rPr>
+        <w:t>Time &amp; attendance (M05)</w:t>
+      </w:r>
+    </w:p>
+    <w:p>
+      <w:pPr>
+        <w:spacing w:after="120"/>
+      </w:pPr>
+      <w:r>
+        <w:rPr>
+          <w:rFonts w:ascii="Calibri" w:hAnsi="Calibri" w:eastAsia="Calibri"/>
+          <w:b w:val="0"/>
+          <w:i w:val="0"/>
+          <w:color w:val="475569"/>
+          <w:sz w:val="20"/>
+        </w:rPr>
+        <w:t>Policy, shifts, holidays, time log upload, biometric S3 pull, HR attendance edit, payroll OT, faculty load. Live clock-in, OB, and ESS corrections — Web, not Desktop.</w:t>
+      </w:r>
+    </w:p>
+    <w:p>
+      <w:pPr>
+        <w:spacing w:after="40"/>
+      </w:pPr>
+      <w:r>
+        <w:rPr>
+          <w:rFonts w:ascii="Calibri" w:hAnsi="Calibri" w:eastAsia="Calibri"/>
+          <w:b/>
+          <w:i w:val="0"/>
+          <w:color w:val="0B318F"/>
+          <w:sz w:val="22"/>
+        </w:rPr>
+        <w:t>Leave &amp; absence (M06)</w:t>
+      </w:r>
+    </w:p>
+    <w:p>
+      <w:pPr>
+        <w:spacing w:after="120"/>
+      </w:pPr>
+      <w:r>
+        <w:rPr>
+          <w:rFonts w:ascii="Calibri" w:hAnsi="Calibri" w:eastAsia="Calibri"/>
+          <w:b w:val="0"/>
+          <w:i w:val="0"/>
+          <w:color w:val="475569"/>
+          <w:sz w:val="20"/>
+        </w:rPr>
+        <w:t>Leave types, policy mapping, attendance-derived leave in payroll, manual/upload in batch. Filing, balances, accrual, manager approval — Web, not Desktop.</w:t>
       </w:r>
     </w:p>
     <w:p>
@@ -1118,7 +1217,7 @@
         <w:tc>
           <w:tcPr>
             <w:tcW w:type="dxa" w:w="1680"/>
-            <w:shd w:fill="FEF3C7" w:val="clear"/>
+            <w:shd w:fill="DCFCE7" w:val="clear"/>
           </w:tcPr>
           <w:p>
             <w:r>
@@ -1126,7 +1225,7 @@
                 <w:rFonts w:ascii="Calibri" w:hAnsi="Calibri" w:eastAsia="Calibri"/>
                 <w:b/>
                 <w:i w:val="0"/>
-                <w:color w:val="92400E"/>
+                <w:color w:val="166534"/>
                 <w:sz w:val="16"/>
               </w:rPr>
             </w:r>
@@ -1135,10 +1234,10 @@
                 <w:rFonts w:ascii="Calibri" w:hAnsi="Calibri" w:eastAsia="Calibri"/>
                 <w:b/>
                 <w:i w:val="0"/>
-                <w:color w:val="92400E"/>
-                <w:sz w:val="16"/>
-              </w:rPr>
-              <w:t>Partial</w:t>
+                <w:color w:val="166534"/>
+                <w:sz w:val="16"/>
+              </w:rPr>
+              <w:t>Ready</w:t>
             </w:r>
           </w:p>
         </w:tc>
@@ -1172,7 +1271,7 @@
         <w:tc>
           <w:tcPr>
             <w:tcW w:type="dxa" w:w="1680"/>
-            <w:shd w:fill="FEF3C7" w:val="clear"/>
+            <w:shd w:fill="DCFCE7" w:val="clear"/>
           </w:tcPr>
           <w:p>
             <w:r>
@@ -1180,7 +1279,7 @@
                 <w:rFonts w:ascii="Calibri" w:hAnsi="Calibri" w:eastAsia="Calibri"/>
                 <w:b/>
                 <w:i w:val="0"/>
-                <w:color w:val="92400E"/>
+                <w:color w:val="166534"/>
                 <w:sz w:val="16"/>
               </w:rPr>
             </w:r>
@@ -1189,10 +1288,10 @@
                 <w:rFonts w:ascii="Calibri" w:hAnsi="Calibri" w:eastAsia="Calibri"/>
                 <w:b/>
                 <w:i w:val="0"/>
-                <w:color w:val="92400E"/>
-                <w:sz w:val="16"/>
-              </w:rPr>
-              <w:t>Partial</w:t>
+                <w:color w:val="166534"/>
+                <w:sz w:val="16"/>
+              </w:rPr>
+              <w:t>Ready</w:t>
             </w:r>
           </w:p>
         </w:tc>
@@ -1654,7 +1753,7 @@
         <w:tc>
           <w:tcPr>
             <w:tcW w:type="dxa" w:w="1680"/>
-            <w:shd w:fill="FEF3C7" w:val="clear"/>
+            <w:shd w:fill="DCFCE7" w:val="clear"/>
           </w:tcPr>
           <w:p>
             <w:r>
@@ -1662,7 +1761,7 @@
                 <w:rFonts w:ascii="Calibri" w:hAnsi="Calibri" w:eastAsia="Calibri"/>
                 <w:b/>
                 <w:i w:val="0"/>
-                <w:color w:val="92400E"/>
+                <w:color w:val="166534"/>
                 <w:sz w:val="16"/>
               </w:rPr>
             </w:r>
@@ -1671,10 +1770,10 @@
                 <w:rFonts w:ascii="Calibri" w:hAnsi="Calibri" w:eastAsia="Calibri"/>
                 <w:b/>
                 <w:i w:val="0"/>
-                <w:color w:val="92400E"/>
-                <w:sz w:val="16"/>
-              </w:rPr>
-              <w:t>Partial</w:t>
+                <w:color w:val="166534"/>
+                <w:sz w:val="16"/>
+              </w:rPr>
+              <w:t>Ready</w:t>
             </w:r>
           </w:p>
         </w:tc>
@@ -1708,7 +1807,7 @@
         <w:tc>
           <w:tcPr>
             <w:tcW w:type="dxa" w:w="1680"/>
-            <w:shd w:fill="FEF3C7" w:val="clear"/>
+            <w:shd w:fill="DCFCE7" w:val="clear"/>
           </w:tcPr>
           <w:p>
             <w:r>
@@ -1716,7 +1815,7 @@
                 <w:rFonts w:ascii="Calibri" w:hAnsi="Calibri" w:eastAsia="Calibri"/>
                 <w:b/>
                 <w:i w:val="0"/>
-                <w:color w:val="92400E"/>
+                <w:color w:val="166534"/>
                 <w:sz w:val="16"/>
               </w:rPr>
             </w:r>
@@ -1725,10 +1824,10 @@
                 <w:rFonts w:ascii="Calibri" w:hAnsi="Calibri" w:eastAsia="Calibri"/>
                 <w:b/>
                 <w:i w:val="0"/>
-                <w:color w:val="92400E"/>
-                <w:sz w:val="16"/>
-              </w:rPr>
-              <w:t>Partial</w:t>
+                <w:color w:val="166534"/>
+                <w:sz w:val="16"/>
+              </w:rPr>
+              <w:t>Ready</w:t>
             </w:r>
           </w:p>
         </w:tc>
@@ -1788,7 +1887,7 @@
         <w:tc>
           <w:tcPr>
             <w:tcW w:type="dxa" w:w="1680"/>
-            <w:shd w:fill="FEF3C7" w:val="clear"/>
+            <w:shd w:fill="DCFCE7" w:val="clear"/>
           </w:tcPr>
           <w:p>
             <w:r>
@@ -1796,7 +1895,7 @@
                 <w:rFonts w:ascii="Calibri" w:hAnsi="Calibri" w:eastAsia="Calibri"/>
                 <w:b/>
                 <w:i w:val="0"/>
-                <w:color w:val="92400E"/>
+                <w:color w:val="166534"/>
                 <w:sz w:val="16"/>
               </w:rPr>
             </w:r>
@@ -1805,10 +1904,10 @@
                 <w:rFonts w:ascii="Calibri" w:hAnsi="Calibri" w:eastAsia="Calibri"/>
                 <w:b/>
                 <w:i w:val="0"/>
-                <w:color w:val="92400E"/>
-                <w:sz w:val="16"/>
-              </w:rPr>
-              <w:t>Partial</w:t>
+                <w:color w:val="166534"/>
+                <w:sz w:val="16"/>
+              </w:rPr>
+              <w:t>Ready</w:t>
             </w:r>
           </w:p>
         </w:tc>
@@ -1842,7 +1941,7 @@
         <w:tc>
           <w:tcPr>
             <w:tcW w:type="dxa" w:w="1680"/>
-            <w:shd w:fill="FEF3C7" w:val="clear"/>
+            <w:shd w:fill="DCFCE7" w:val="clear"/>
           </w:tcPr>
           <w:p>
             <w:r>
@@ -1850,7 +1949,7 @@
                 <w:rFonts w:ascii="Calibri" w:hAnsi="Calibri" w:eastAsia="Calibri"/>
                 <w:b/>
                 <w:i w:val="0"/>
-                <w:color w:val="92400E"/>
+                <w:color w:val="166534"/>
                 <w:sz w:val="16"/>
               </w:rPr>
             </w:r>
@@ -1859,10 +1958,10 @@
                 <w:rFonts w:ascii="Calibri" w:hAnsi="Calibri" w:eastAsia="Calibri"/>
                 <w:b/>
                 <w:i w:val="0"/>
-                <w:color w:val="92400E"/>
-                <w:sz w:val="16"/>
-              </w:rPr>
-              <w:t>Partial</w:t>
+                <w:color w:val="166534"/>
+                <w:sz w:val="16"/>
+              </w:rPr>
+              <w:t>Ready</w:t>
             </w:r>
           </w:p>
         </w:tc>
@@ -4980,7 +5079,7 @@
         <w:tc>
           <w:tcPr>
             <w:tcW w:type="dxa" w:w="2016"/>
-            <w:shd w:fill="FEF3C7" w:val="clear"/>
+            <w:shd w:fill="DCFCE7" w:val="clear"/>
           </w:tcPr>
           <w:p>
             <w:r>
@@ -4988,7 +5087,7 @@
                 <w:rFonts w:ascii="Calibri" w:hAnsi="Calibri" w:eastAsia="Calibri"/>
                 <w:b/>
                 <w:i w:val="0"/>
-                <w:color w:val="92400E"/>
+                <w:color w:val="166534"/>
                 <w:sz w:val="16"/>
               </w:rPr>
             </w:r>
@@ -4997,10 +5096,10 @@
                 <w:rFonts w:ascii="Calibri" w:hAnsi="Calibri" w:eastAsia="Calibri"/>
                 <w:b/>
                 <w:i w:val="0"/>
-                <w:color w:val="92400E"/>
-                <w:sz w:val="16"/>
-              </w:rPr>
-              <w:t>Partial</w:t>
+                <w:color w:val="166534"/>
+                <w:sz w:val="16"/>
+              </w:rPr>
+              <w:t>Ready</w:t>
             </w:r>
           </w:p>
         </w:tc>
@@ -5044,7 +5143,7 @@
                 <w:i w:val="0"/>
                 <w:sz w:val="16"/>
               </w:rPr>
-              <w:t>Desktop has org masters. Web has users/roles + API keys only.</w:t>
+              <w:t>Desktop org masters are ready. Org chart deferred. Approval matrices are Web (iskolaris-fe/be), not Desktop.</w:t>
             </w:r>
           </w:p>
         </w:tc>
@@ -5301,7 +5400,7 @@
         <w:tc>
           <w:tcPr>
             <w:tcW w:type="dxa" w:w="2016"/>
-            <w:shd w:fill="FEF3C7" w:val="clear"/>
+            <w:shd w:fill="DCFCE7" w:val="clear"/>
           </w:tcPr>
           <w:p>
             <w:r>
@@ -5309,7 +5408,7 @@
                 <w:rFonts w:ascii="Calibri" w:hAnsi="Calibri" w:eastAsia="Calibri"/>
                 <w:b/>
                 <w:i w:val="0"/>
-                <w:color w:val="92400E"/>
+                <w:color w:val="166534"/>
                 <w:sz w:val="16"/>
               </w:rPr>
             </w:r>
@@ -5318,10 +5417,10 @@
                 <w:rFonts w:ascii="Calibri" w:hAnsi="Calibri" w:eastAsia="Calibri"/>
                 <w:b/>
                 <w:i w:val="0"/>
-                <w:color w:val="92400E"/>
-                <w:sz w:val="16"/>
-              </w:rPr>
-              <w:t>Partial</w:t>
+                <w:color w:val="166534"/>
+                <w:sz w:val="16"/>
+              </w:rPr>
+              <w:t>Ready</w:t>
             </w:r>
           </w:p>
         </w:tc>
@@ -5365,7 +5464,7 @@
                 <w:i w:val="0"/>
                 <w:sz w:val="16"/>
               </w:rPr>
-              <w:t>Desktop import/payroll. Web checker + ESS read. No live clock-in.</w:t>
+              <w:t>Desktop import/process ready. Live clock-in, OB, ESS corrections, attendance approval — Web (iskolaris-fe/be), not Desktop.</w:t>
             </w:r>
           </w:p>
         </w:tc>
@@ -5408,7 +5507,7 @@
         <w:tc>
           <w:tcPr>
             <w:tcW w:type="dxa" w:w="2016"/>
-            <w:shd w:fill="FEF3C7" w:val="clear"/>
+            <w:shd w:fill="DCFCE7" w:val="clear"/>
           </w:tcPr>
           <w:p>
             <w:r>
@@ -5416,7 +5515,7 @@
                 <w:rFonts w:ascii="Calibri" w:hAnsi="Calibri" w:eastAsia="Calibri"/>
                 <w:b/>
                 <w:i w:val="0"/>
-                <w:color w:val="92400E"/>
+                <w:color w:val="166534"/>
                 <w:sz w:val="16"/>
               </w:rPr>
             </w:r>
@@ -5425,10 +5524,10 @@
                 <w:rFonts w:ascii="Calibri" w:hAnsi="Calibri" w:eastAsia="Calibri"/>
                 <w:b/>
                 <w:i w:val="0"/>
-                <w:color w:val="92400E"/>
-                <w:sz w:val="16"/>
-              </w:rPr>
-              <w:t>Partial</w:t>
+                <w:color w:val="166534"/>
+                <w:sz w:val="16"/>
+              </w:rPr>
+              <w:t>Ready</w:t>
             </w:r>
           </w:p>
         </w:tc>
@@ -5472,7 +5571,7 @@
                 <w:i w:val="0"/>
                 <w:sz w:val="16"/>
               </w:rPr>
-              <w:t>Desktop leave types for payroll only. No filing on either product.</w:t>
+              <w:t>Desktop payroll leave ready. Filing, balances, accrual, manager approval — Web (iskolaris-fe/be), not Desktop.</w:t>
             </w:r>
           </w:p>
         </w:tc>
@@ -7015,6 +7114,51 @@
           <w:b w:val="0"/>
           <w:i w:val="0"/>
           <w:color w:val="475569"/>
+          <w:sz w:val="20"/>
+        </w:rPr>
+        <w:t>M01 desktop is Ready. Org chart is deferred. Approval matrices will be built on Web (iskolaris-fe / iskolaris-be) by another owner — not on Desktop.</w:t>
+      </w:r>
+    </w:p>
+    <w:p>
+      <w:pPr>
+        <w:spacing w:after="160" w:line="276" w:lineRule="auto"/>
+      </w:pPr>
+      <w:r>
+        <w:rPr>
+          <w:rFonts w:ascii="Calibri" w:hAnsi="Calibri" w:eastAsia="Calibri"/>
+          <w:b w:val="0"/>
+          <w:i w:val="0"/>
+          <w:color w:val="475569"/>
+          <w:sz w:val="20"/>
+        </w:rPr>
+        <w:t>M05 desktop is Ready. Live clock-in, QR punch, official business, ESS time corrections, and attendance approval workflow will be built on Web — not on Desktop.</w:t>
+      </w:r>
+    </w:p>
+    <w:p>
+      <w:pPr>
+        <w:spacing w:after="160" w:line="276" w:lineRule="auto"/>
+      </w:pPr>
+      <w:r>
+        <w:rPr>
+          <w:rFonts w:ascii="Calibri" w:hAnsi="Calibri" w:eastAsia="Calibri"/>
+          <w:b w:val="0"/>
+          <w:i w:val="0"/>
+          <w:color w:val="475569"/>
+          <w:sz w:val="20"/>
+        </w:rPr>
+        <w:t>M06 desktop is Ready. Leave filing, balances, accrual, and manager approval will be built on Web (iskolaris-fe / iskolaris-be) — not on Desktop.</w:t>
+      </w:r>
+    </w:p>
+    <w:p>
+      <w:pPr>
+        <w:spacing w:after="160" w:line="276" w:lineRule="auto"/>
+      </w:pPr>
+      <w:r>
+        <w:rPr>
+          <w:rFonts w:ascii="Calibri" w:hAnsi="Calibri" w:eastAsia="Calibri"/>
+          <w:b w:val="0"/>
+          <w:i w:val="0"/>
+          <w:color w:val="475569"/>
           <w:sz w:val="22"/>
         </w:rPr>
         <w:t>From the Combined position (Desktop payroll + Web ESS), close the biggest MVP gaps first:</w:t>
@@ -7032,7 +7176,7 @@
           <w:color w:val="475569"/>
           <w:sz w:val="22"/>
         </w:rPr>
-        <w:t>1. Leave filing &amp; balances (M06) — use Web ESS shell; Desktop already has leave types.</w:t>
+        <w:t>1. Leave filing &amp; balances (M06 web) — build on desktop leave types + Web ESS shell.</w:t>
       </w:r>
     </w:p>
     <w:p>

</xml_diff>